<commit_message>
docs: expand SensorHost SD guide
</commit_message>
<xml_diff>
--- a/docs/SensorHost上位机操作指南.docx
+++ b/docs/SensorHost上位机操作指南.docx
@@ -1762,7 +1762,7 @@
       <w:r>
         <w:drawing>
           <wp:inline xmlns:a="http://schemas.openxmlformats.org/drawingml/2006/main" xmlns:pic="http://schemas.openxmlformats.org/drawingml/2006/picture">
-            <wp:extent cx="6080760" cy="1672209"/>
+            <wp:extent cx="6080760" cy="3800475"/>
             <wp:docPr id="5" name="Picture 5"/>
             <wp:cNvGraphicFramePr>
               <a:graphicFrameLocks noChangeAspect="1"/>
@@ -1771,7 +1771,7 @@
               <a:graphicData uri="http://schemas.openxmlformats.org/drawingml/2006/picture">
                 <pic:pic>
                   <pic:nvPicPr>
-                    <pic:cNvPr id="0" name="sensorhost_sd_export_flow.png"/>
+                    <pic:cNvPr id="0" name="sensorhost_sd_archive_overview.png"/>
                     <pic:cNvPicPr/>
                   </pic:nvPicPr>
                   <pic:blipFill>
@@ -1783,7 +1783,7 @@
                   <pic:spPr>
                     <a:xfrm>
                       <a:off x="0" y="0"/>
-                      <a:ext cx="6080760" cy="1672209"/>
+                      <a:ext cx="6080760" cy="3800475"/>
                     </a:xfrm>
                     <a:prstGeom prst="rect"/>
                   </pic:spPr>
@@ -1804,7 +1804,7 @@
           <w:color w:val="5B6672"/>
           <w:sz w:val="18"/>
         </w:rPr>
-        <w:t>图 5  SD 历史数据导出与本地回放的方向</w:t>
+        <w:t>图 5  SD ARCHIVE 页面：设备存档、导出按钮和本地导出库</w:t>
       </w:r>
     </w:p>
     <w:p>
@@ -1990,8 +1990,129 @@
       </w:r>
     </w:p>
     <w:p>
+      <w:pPr>
+        <w:pStyle w:val="Heading1"/>
+      </w:pPr>
       <w:r>
-        <w:br w:type="page"/>
+        <w:rPr>
+          <w:rFonts w:ascii="Microsoft YaHei" w:hAnsi="Microsoft YaHei" w:eastAsia="Microsoft YaHei"/>
+          <w:b/>
+          <w:color w:val="000000"/>
+          <w:sz w:val="32"/>
+        </w:rPr>
+        <w:t>6 查看导出进度</w:t>
+      </w:r>
+    </w:p>
+    <w:p>
+      <w:pPr>
+        <w:spacing w:after="100"/>
+      </w:pPr>
+      <w:r>
+        <w:rPr>
+          <w:rFonts w:ascii="Microsoft YaHei" w:hAnsi="Microsoft YaHei" w:eastAsia="Microsoft YaHei"/>
+          <w:color w:val="202A36"/>
+          <w:sz w:val="21"/>
+        </w:rPr>
+        <w:t>导出期间，EXPORT PROGRESS 会显示当前状态。正常完成后状态为 COMPLETE；如果中途取消或连接中断，记录会保留相应的中止状态。</w:t>
+      </w:r>
+    </w:p>
+    <w:p>
+      <w:pPr>
+        <w:keepNext/>
+        <w:spacing w:before="40" w:after="40"/>
+        <w:jc w:val="center"/>
+      </w:pPr>
+      <w:r>
+        <w:drawing>
+          <wp:inline xmlns:a="http://schemas.openxmlformats.org/drawingml/2006/main" xmlns:pic="http://schemas.openxmlformats.org/drawingml/2006/picture">
+            <wp:extent cx="6080760" cy="3800475"/>
+            <wp:docPr id="6" name="Picture 6"/>
+            <wp:cNvGraphicFramePr>
+              <a:graphicFrameLocks noChangeAspect="1"/>
+            </wp:cNvGraphicFramePr>
+            <a:graphic>
+              <a:graphicData uri="http://schemas.openxmlformats.org/drawingml/2006/picture">
+                <pic:pic>
+                  <pic:nvPicPr>
+                    <pic:cNvPr id="0" name="sensorhost_sd_export_progress.png"/>
+                    <pic:cNvPicPr/>
+                  </pic:nvPicPr>
+                  <pic:blipFill>
+                    <a:blip r:embed="rId15"/>
+                    <a:stretch>
+                      <a:fillRect/>
+                    </a:stretch>
+                  </pic:blipFill>
+                  <pic:spPr>
+                    <a:xfrm>
+                      <a:off x="0" y="0"/>
+                      <a:ext cx="6080760" cy="3800475"/>
+                    </a:xfrm>
+                    <a:prstGeom prst="rect"/>
+                  </pic:spPr>
+                </pic:pic>
+              </a:graphicData>
+            </a:graphic>
+          </wp:inline>
+        </w:drawing>
+      </w:r>
+    </w:p>
+    <w:p>
+      <w:pPr>
+        <w:pStyle w:val="Caption"/>
+      </w:pPr>
+      <w:r>
+        <w:rPr>
+          <w:rFonts w:ascii="Microsoft YaHei" w:hAnsi="Microsoft YaHei" w:eastAsia="Microsoft YaHei"/>
+          <w:color w:val="5B6672"/>
+          <w:sz w:val="18"/>
+        </w:rPr>
+        <w:t>图 6  导出进行中：查看进度并可取消本次导出</w:t>
+      </w:r>
+    </w:p>
+    <w:p>
+      <w:pPr>
+        <w:pStyle w:val="ListBullet"/>
+        <w:spacing w:after="60"/>
+        <w:ind w:left="283"/>
+      </w:pPr>
+      <w:r>
+        <w:rPr>
+          <w:rFonts w:ascii="Microsoft YaHei" w:hAnsi="Microsoft YaHei" w:eastAsia="Microsoft YaHei"/>
+          <w:color w:val="202A36"/>
+          <w:sz w:val="21"/>
+        </w:rPr>
+        <w:t>EXPORT PROGRESS：查看接收字节、SD 分配空间、速度和耗时。</w:t>
+      </w:r>
+    </w:p>
+    <w:p>
+      <w:pPr>
+        <w:pStyle w:val="ListBullet"/>
+        <w:spacing w:after="60"/>
+        <w:ind w:left="283"/>
+      </w:pPr>
+      <w:r>
+        <w:rPr>
+          <w:rFonts w:ascii="Microsoft YaHei" w:hAnsi="Microsoft YaHei" w:eastAsia="Microsoft YaHei"/>
+          <w:color w:val="202A36"/>
+          <w:sz w:val="21"/>
+        </w:rPr>
+        <w:t>CANCEL：需要中止时点击；已接收部分会保留并标记为 aborted。</w:t>
+      </w:r>
+    </w:p>
+    <w:p>
+      <w:pPr>
+        <w:pStyle w:val="ListBullet"/>
+        <w:spacing w:after="60"/>
+        <w:ind w:left="283"/>
+      </w:pPr>
+      <w:r>
+        <w:rPr>
+          <w:rFonts w:ascii="Microsoft YaHei" w:hAnsi="Microsoft YaHei" w:eastAsia="Microsoft YaHei"/>
+          <w:color w:val="202A36"/>
+          <w:sz w:val="21"/>
+        </w:rPr>
+        <w:t>导出结束后回到 LOCAL EXPORT LIBRARY，优先选择状态为 complete 的文件回放。</w:t>
       </w:r>
     </w:p>
     <w:p>
@@ -2005,7 +2126,7 @@
           <w:color w:val="000000"/>
           <w:sz w:val="32"/>
         </w:rPr>
-        <w:t>6 打开导出文件回放</w:t>
+        <w:t>7 导入导出文件并回放</w:t>
       </w:r>
     </w:p>
     <w:p>
@@ -2018,7 +2139,115 @@
           <w:color w:val="202A36"/>
           <w:sz w:val="21"/>
         </w:rPr>
-        <w:t>导出文件不需要重新连接设备即可回放。回放会复用 LIVE MONITOR 的波形和姿态显示。</w:t>
+        <w:t>这里的“导入”是把电脑上的导出文件打开到上位机进行回放，不会把文件写回设备 SD 卡。导出文件不需要重新连接设备即可回放。</w:t>
+      </w:r>
+    </w:p>
+    <w:p>
+      <w:pPr>
+        <w:keepNext/>
+        <w:spacing w:before="40" w:after="40"/>
+        <w:jc w:val="center"/>
+      </w:pPr>
+      <w:r>
+        <w:drawing>
+          <wp:inline xmlns:a="http://schemas.openxmlformats.org/drawingml/2006/main" xmlns:pic="http://schemas.openxmlformats.org/drawingml/2006/picture">
+            <wp:extent cx="6080760" cy="1672209"/>
+            <wp:docPr id="7" name="Picture 7"/>
+            <wp:cNvGraphicFramePr>
+              <a:graphicFrameLocks noChangeAspect="1"/>
+            </wp:cNvGraphicFramePr>
+            <a:graphic>
+              <a:graphicData uri="http://schemas.openxmlformats.org/drawingml/2006/picture">
+                <pic:pic>
+                  <pic:nvPicPr>
+                    <pic:cNvPr id="0" name="sensorhost_sd_export_flow.png"/>
+                    <pic:cNvPicPr/>
+                  </pic:nvPicPr>
+                  <pic:blipFill>
+                    <a:blip r:embed="rId16"/>
+                    <a:stretch>
+                      <a:fillRect/>
+                    </a:stretch>
+                  </pic:blipFill>
+                  <pic:spPr>
+                    <a:xfrm>
+                      <a:off x="0" y="0"/>
+                      <a:ext cx="6080760" cy="1672209"/>
+                    </a:xfrm>
+                    <a:prstGeom prst="rect"/>
+                  </pic:spPr>
+                </pic:pic>
+              </a:graphicData>
+            </a:graphic>
+          </wp:inline>
+        </w:drawing>
+      </w:r>
+    </w:p>
+    <w:p>
+      <w:pPr>
+        <w:pStyle w:val="Caption"/>
+      </w:pPr>
+      <w:r>
+        <w:rPr>
+          <w:rFonts w:ascii="Microsoft YaHei" w:hAnsi="Microsoft YaHei" w:eastAsia="Microsoft YaHei"/>
+          <w:color w:val="5B6672"/>
+          <w:sz w:val="18"/>
+        </w:rPr>
+        <w:t>图 7  SD 历史数据导出、导入上位机与回放的数据方向</w:t>
+      </w:r>
+    </w:p>
+    <w:p>
+      <w:pPr>
+        <w:keepNext/>
+        <w:spacing w:before="40" w:after="40"/>
+        <w:jc w:val="center"/>
+      </w:pPr>
+      <w:r>
+        <w:drawing>
+          <wp:inline xmlns:a="http://schemas.openxmlformats.org/drawingml/2006/main" xmlns:pic="http://schemas.openxmlformats.org/drawingml/2006/picture">
+            <wp:extent cx="6080760" cy="3800475"/>
+            <wp:docPr id="8" name="Picture 8"/>
+            <wp:cNvGraphicFramePr>
+              <a:graphicFrameLocks noChangeAspect="1"/>
+            </wp:cNvGraphicFramePr>
+            <a:graphic>
+              <a:graphicData uri="http://schemas.openxmlformats.org/drawingml/2006/picture">
+                <pic:pic>
+                  <pic:nvPicPr>
+                    <pic:cNvPr id="0" name="sensorhost_playback_controls.png"/>
+                    <pic:cNvPicPr/>
+                  </pic:nvPicPr>
+                  <pic:blipFill>
+                    <a:blip r:embed="rId17"/>
+                    <a:stretch>
+                      <a:fillRect/>
+                    </a:stretch>
+                  </pic:blipFill>
+                  <pic:spPr>
+                    <a:xfrm>
+                      <a:off x="0" y="0"/>
+                      <a:ext cx="6080760" cy="3800475"/>
+                    </a:xfrm>
+                    <a:prstGeom prst="rect"/>
+                  </pic:spPr>
+                </pic:pic>
+              </a:graphicData>
+            </a:graphic>
+          </wp:inline>
+        </w:drawing>
+      </w:r>
+    </w:p>
+    <w:p>
+      <w:pPr>
+        <w:pStyle w:val="Caption"/>
+      </w:pPr>
+      <w:r>
+        <w:rPr>
+          <w:rFonts w:ascii="Microsoft YaHei" w:hAnsi="Microsoft YaHei" w:eastAsia="Microsoft YaHei"/>
+          <w:color w:val="5B6672"/>
+          <w:sz w:val="18"/>
+        </w:rPr>
+        <w:t>图 8  回放状态：文件名、播放控制、进度和倍速</w:t>
       </w:r>
     </w:p>
     <w:p>
@@ -2150,6 +2379,11 @@
       </w:r>
     </w:p>
     <w:p>
+      <w:r>
+        <w:br w:type="page"/>
+      </w:r>
+    </w:p>
+    <w:p>
       <w:pPr>
         <w:pStyle w:val="Heading1"/>
       </w:pPr>
@@ -2160,7 +2394,7 @@
           <w:color w:val="000000"/>
           <w:sz w:val="32"/>
         </w:rPr>
-        <w:t>7 安全停止和退出</w:t>
+        <w:t>8 安全停止和退出</w:t>
       </w:r>
     </w:p>
     <w:p>
@@ -2305,7 +2539,7 @@
           <w:color w:val="000000"/>
           <w:sz w:val="32"/>
         </w:rPr>
-        <w:t>8 两个常见提示</w:t>
+        <w:t>9 两个常见提示</w:t>
       </w:r>
     </w:p>
     <w:p>

</xml_diff>

<commit_message>
docs: make SensorHost guide Wi-Fi focused
</commit_message>
<xml_diff>
--- a/docs/SensorHost上位机操作指南.docx
+++ b/docs/SensorHost上位机操作指南.docx
@@ -27,7 +27,7 @@
           <w:color w:val="5B6672"/>
           <w:sz w:val="26"/>
         </w:rPr>
-        <w:t>设备连接、实时波形查看与 SD 卡数据导出</w:t>
+        <w:t>Wi-Fi 连接、实时波形查看与 SD 卡数据导出</w:t>
       </w:r>
     </w:p>
     <w:p>
@@ -40,12 +40,13 @@
           <w:color w:val="202A36"/>
           <w:sz w:val="21"/>
         </w:rPr>
-        <w:t>本指南面向第一次使用 SensorHost 的操作人员。按下面的顺序操作，即可完成设备连接、查看实时数据、保存记录，并把设备 SD 卡中的历史数据导出到电脑。</w:t>
+        <w:t>本指南面向第一次使用 SensorHost 的现场操作人员，主线按 Wi-Fi 连接方式编写。按下面的顺序操作，即可完成网络连接、查看实时数据、保存记录，并把设备 SD 卡中的历史数据导出到电脑。</w:t>
       </w:r>
     </w:p>
     <w:p>
       <w:pPr>
         <w:pStyle w:val="Heading1"/>
+        <w:pageBreakBefore w:val="0"/>
       </w:pPr>
       <w:r>
         <w:rPr>
@@ -78,7 +79,7 @@
           <w:color w:val="000000"/>
           <w:sz w:val="21"/>
         </w:rPr>
-        <w:t>连接设备。</w:t>
+        <w:t>准备网络。</w:t>
       </w:r>
       <w:r>
         <w:rPr>
@@ -86,7 +87,7 @@
           <w:color w:val="202A36"/>
           <w:sz w:val="21"/>
         </w:rPr>
-        <w:t>选择 CDC，刷新并选择 STM32 的 COM 口，点击 CONNECT。</w:t>
+        <w:t>让电脑和每个 ESP 网关加入同一个手机热点，确认热点允许设备之间通信。</w:t>
       </w:r>
     </w:p>
     <w:p>
@@ -110,7 +111,7 @@
           <w:color w:val="000000"/>
           <w:sz w:val="21"/>
         </w:rPr>
-        <w:t>开始采集。</w:t>
+        <w:t>启动监听。</w:t>
       </w:r>
       <w:r>
         <w:rPr>
@@ -118,7 +119,7 @@
           <w:color w:val="202A36"/>
           <w:sz w:val="21"/>
         </w:rPr>
-        <w:t>将 LIVE TARGET 设为 CDC，点击 START。</w:t>
+        <w:t>选择 WI-FI，填写热点网卡、PC IPv4 和端口，点击 CONNECT，看到 LISTENING。</w:t>
       </w:r>
     </w:p>
     <w:p>
@@ -134,6 +135,38 @@
           <w:sz w:val="21"/>
         </w:rPr>
         <w:t xml:space="preserve">3. </w:t>
+      </w:r>
+      <w:r>
+        <w:rPr>
+          <w:rFonts w:ascii="Microsoft YaHei" w:hAnsi="Microsoft YaHei" w:eastAsia="Microsoft YaHei"/>
+          <w:b/>
+          <w:color w:val="000000"/>
+          <w:sz w:val="21"/>
+        </w:rPr>
+        <w:t>开始采集。</w:t>
+      </w:r>
+      <w:r>
+        <w:rPr>
+          <w:rFonts w:ascii="Microsoft YaHei" w:hAnsi="Microsoft YaHei" w:eastAsia="Microsoft YaHei"/>
+          <w:color w:val="202A36"/>
+          <w:sz w:val="21"/>
+        </w:rPr>
+        <w:t>在 DEVICES 中选中在线节点，将 LIVE TARGET 设为 UART，点击 START。</w:t>
+      </w:r>
+    </w:p>
+    <w:p>
+      <w:pPr>
+        <w:spacing w:after="80"/>
+        <w:ind w:left="142" w:hanging="142"/>
+      </w:pPr>
+      <w:r>
+        <w:rPr>
+          <w:rFonts w:ascii="Microsoft YaHei" w:hAnsi="Microsoft YaHei" w:eastAsia="Microsoft YaHei"/>
+          <w:b/>
+          <w:color w:val="1DBFB4"/>
+          <w:sz w:val="21"/>
+        </w:rPr>
+        <w:t xml:space="preserve">4. </w:t>
       </w:r>
       <w:r>
         <w:rPr>
@@ -165,7 +198,7 @@
           <w:color w:val="1DBFB4"/>
           <w:sz w:val="21"/>
         </w:rPr>
-        <w:t xml:space="preserve">4. </w:t>
+        <w:t xml:space="preserve">5. </w:t>
       </w:r>
       <w:r>
         <w:rPr>
@@ -174,7 +207,7 @@
           <w:color w:val="000000"/>
           <w:sz w:val="21"/>
         </w:rPr>
-        <w:t>需要保存时。</w:t>
+        <w:t>保存或导出。</w:t>
       </w:r>
       <w:r>
         <w:rPr>
@@ -188,6 +221,7 @@
     <w:p>
       <w:pPr>
         <w:pStyle w:val="Heading1"/>
+        <w:pageBreakBefore w:val="0"/>
       </w:pPr>
       <w:r>
         <w:rPr>
@@ -211,7 +245,7 @@
           <w:color w:val="202A36"/>
           <w:sz w:val="21"/>
         </w:rPr>
-        <w:t>STM32 采集板已上电，USB 数据线已连接到电脑。</w:t>
+        <w:t>电脑已连接手机热点或现场 Wi-Fi；每个 ESP 网关也加入同一个网络。</w:t>
       </w:r>
     </w:p>
     <w:p>
@@ -226,7 +260,7 @@
           <w:color w:val="202A36"/>
           <w:sz w:val="21"/>
         </w:rPr>
-        <w:t>Windows 设备管理器中能看到 USB 串行设备（COMx）。COM 号可能因电脑或 USB 插口变化。</w:t>
+        <w:t>已知 ESP 固件中预设的 PC IPv4；上位机选择的热点网卡 IPv4 必须与它一致。</w:t>
       </w:r>
     </w:p>
     <w:p>
@@ -241,7 +275,7 @@
           <w:color w:val="202A36"/>
           <w:sz w:val="21"/>
         </w:rPr>
-        <w:t>本指南以 CDC 为例；使用 WI-FI 时选择 WI-FI，并按页面填写网卡和 PC IPv4，确保电脑与设备在同一网络。</w:t>
+        <w:t>默认 TCP 端口为 54321、UDP 唤醒端口为 12345；只有端口被修改时才需要改动。</w:t>
       </w:r>
     </w:p>
     <w:p>
@@ -263,17 +297,13 @@
           <w:color w:val="202A36"/>
           <w:sz w:val="21"/>
         </w:rPr>
-        <w:t>CONNECT 只建立连接和查询设备，不会自动 START。连接成功后没有波形时，通常还需要选择 LIVE TARGET=CDC 并点击 START。</w:t>
-      </w:r>
-    </w:p>
-    <w:p>
-      <w:r>
-        <w:br w:type="page"/>
+        <w:t>Wi-Fi 模式下 CONNECT 启动的是电脑端监听，不会自动启动设备采集。看到节点在线后，还要选择 LIVE TARGET=UART 并点击 START。CDC 仅用于单机调试。</w:t>
       </w:r>
     </w:p>
     <w:p>
       <w:pPr>
         <w:pStyle w:val="Heading1"/>
+        <w:pageBreakBefore/>
       </w:pPr>
       <w:r>
         <w:rPr>
@@ -295,7 +325,7 @@
           <w:color w:val="202A36"/>
           <w:sz w:val="21"/>
         </w:rPr>
-        <w:t>上位机按“连接、采集、设备、数据页面”分区。第一次使用时，先看懂这些区域，再按后面的步骤操作。</w:t>
+        <w:t>上位机按“连接、采集、设备、数据页面”分区。Wi-Fi 现场使用时，先配置左侧 WI-FI FIELD MODE，再从 DEVICES 选择要查看的节点。</w:t>
       </w:r>
     </w:p>
     <w:p>
@@ -307,7 +337,7 @@
       <w:r>
         <w:drawing>
           <wp:inline xmlns:a="http://schemas.openxmlformats.org/drawingml/2006/main" xmlns:pic="http://schemas.openxmlformats.org/drawingml/2006/picture">
-            <wp:extent cx="6080760" cy="3345011"/>
+            <wp:extent cx="5486400" cy="3429000"/>
             <wp:docPr id="1" name="Picture 1"/>
             <wp:cNvGraphicFramePr>
               <a:graphicFrameLocks noChangeAspect="1"/>
@@ -316,7 +346,7 @@
               <a:graphicData uri="http://schemas.openxmlformats.org/drawingml/2006/picture">
                 <pic:pic>
                   <pic:nvPicPr>
-                    <pic:cNvPr id="0" name="native-live-1440x900-scale1.5.png"/>
+                    <pic:cNvPr id="0" name="sensorhost_wifi_connection.png"/>
                     <pic:cNvPicPr/>
                   </pic:nvPicPr>
                   <pic:blipFill>
@@ -328,7 +358,7 @@
                   <pic:spPr>
                     <a:xfrm>
                       <a:off x="0" y="0"/>
-                      <a:ext cx="6080760" cy="3345011"/>
+                      <a:ext cx="5486400" cy="3429000"/>
                     </a:xfrm>
                     <a:prstGeom prst="rect"/>
                   </pic:spPr>
@@ -349,7 +379,7 @@
           <w:color w:val="5B6672"/>
           <w:sz w:val="18"/>
         </w:rPr>
-        <w:t>图 1  上位机主界面示例</w:t>
+        <w:t>图 1  Wi-Fi 模式连接配置界面</w:t>
       </w:r>
     </w:p>
     <w:tbl>
@@ -502,7 +532,7 @@
                 <w:color w:val="202A36"/>
                 <w:sz w:val="18"/>
               </w:rPr>
-              <w:t>选择 CDC / WI-FI、选择设备或 COM 口、REFRESH、CONNECT / DISCONNECT。</w:t>
+              <w:t>选择 WI-FI 或调试用 CDC；Wi-Fi 时显示监听状态，使用 REFRESH、CONNECT / DISCONNECT。</w:t>
             </w:r>
           </w:p>
         </w:tc>
@@ -538,6 +568,76 @@
                 <w:color w:val="202A36"/>
                 <w:sz w:val="18"/>
               </w:rPr>
+              <w:t>WI-FI FIELD MODE</w:t>
+            </w:r>
+          </w:p>
+        </w:tc>
+        <w:tc>
+          <w:tcPr>
+            <w:tcW w:type="dxa" w:w="7200"/>
+            <w:shd w:fill="EAF3F8"/>
+            <w:tcBorders>
+              <w:top w:val="single" w:sz="6" w:space="0" w:color="D9E0E5"/>
+              <w:left w:val="single" w:sz="6" w:space="0" w:color="D9E0E5"/>
+              <w:bottom w:val="single" w:sz="6" w:space="0" w:color="D9E0E5"/>
+              <w:right w:val="single" w:sz="6" w:space="0" w:color="D9E0E5"/>
+              <w:insideH w:val="single" w:sz="6" w:space="0" w:color="D9E0E5"/>
+              <w:insideV w:val="single" w:sz="6" w:space="0" w:color="D9E0E5"/>
+            </w:tcBorders>
+            <w:tcMar>
+              <w:top w:w="110" w:type="dxa"/>
+              <w:start w:w="140" w:type="dxa"/>
+              <w:bottom w:w="110" w:type="dxa"/>
+              <w:end w:w="140" w:type="dxa"/>
+            </w:tcMar>
+            <w:vAlign w:val="center"/>
+          </w:tcPr>
+          <w:p>
+            <w:pPr>
+              <w:spacing w:after="0"/>
+            </w:pPr>
+            <w:r>
+              <w:rPr>
+                <w:rFonts w:ascii="Microsoft YaHei" w:hAnsi="Microsoft YaHei" w:eastAsia="Microsoft YaHei"/>
+                <w:color w:val="202A36"/>
+                <w:sz w:val="18"/>
+              </w:rPr>
+              <w:t>选择手机热点网卡，填写 PC IPv4、TCP/UDP 端口和可选 ESP IPv4 目标。</w:t>
+            </w:r>
+          </w:p>
+        </w:tc>
+      </w:tr>
+      <w:tr>
+        <w:tc>
+          <w:tcPr>
+            <w:tcW w:type="dxa" w:w="2376"/>
+            <w:shd w:fill="FFFFFF"/>
+            <w:tcBorders>
+              <w:top w:val="single" w:sz="6" w:space="0" w:color="D9E0E5"/>
+              <w:left w:val="single" w:sz="6" w:space="0" w:color="D9E0E5"/>
+              <w:bottom w:val="single" w:sz="6" w:space="0" w:color="D9E0E5"/>
+              <w:right w:val="single" w:sz="6" w:space="0" w:color="D9E0E5"/>
+              <w:insideH w:val="single" w:sz="6" w:space="0" w:color="D9E0E5"/>
+              <w:insideV w:val="single" w:sz="6" w:space="0" w:color="D9E0E5"/>
+            </w:tcBorders>
+            <w:tcMar>
+              <w:top w:w="110" w:type="dxa"/>
+              <w:start w:w="140" w:type="dxa"/>
+              <w:bottom w:w="110" w:type="dxa"/>
+              <w:end w:w="140" w:type="dxa"/>
+            </w:tcMar>
+            <w:vAlign w:val="center"/>
+          </w:tcPr>
+          <w:p>
+            <w:pPr>
+              <w:spacing w:after="0"/>
+            </w:pPr>
+            <w:r>
+              <w:rPr>
+                <w:rFonts w:ascii="Microsoft YaHei" w:hAnsi="Microsoft YaHei" w:eastAsia="Microsoft YaHei"/>
+                <w:color w:val="202A36"/>
+                <w:sz w:val="18"/>
+              </w:rPr>
               <w:t>采集工具栏</w:t>
             </w:r>
           </w:p>
@@ -545,7 +645,7 @@
         <w:tc>
           <w:tcPr>
             <w:tcW w:type="dxa" w:w="7200"/>
-            <w:shd w:fill="EAF3F8"/>
+            <w:shd w:fill="FFFFFF"/>
             <w:tcBorders>
               <w:top w:val="single" w:sz="6" w:space="0" w:color="D9E0E5"/>
               <w:left w:val="single" w:sz="6" w:space="0" w:color="D9E0E5"/>
@@ -581,7 +681,7 @@
         <w:tc>
           <w:tcPr>
             <w:tcW w:type="dxa" w:w="2376"/>
-            <w:shd w:fill="FFFFFF"/>
+            <w:shd w:fill="EAF3F8"/>
             <w:tcBorders>
               <w:top w:val="single" w:sz="6" w:space="0" w:color="D9E0E5"/>
               <w:left w:val="single" w:sz="6" w:space="0" w:color="D9E0E5"/>
@@ -615,6 +715,42 @@
         <w:tc>
           <w:tcPr>
             <w:tcW w:type="dxa" w:w="7200"/>
+            <w:shd w:fill="EAF3F8"/>
+            <w:tcBorders>
+              <w:top w:val="single" w:sz="6" w:space="0" w:color="D9E0E5"/>
+              <w:left w:val="single" w:sz="6" w:space="0" w:color="D9E0E5"/>
+              <w:bottom w:val="single" w:sz="6" w:space="0" w:color="D9E0E5"/>
+              <w:right w:val="single" w:sz="6" w:space="0" w:color="D9E0E5"/>
+              <w:insideH w:val="single" w:sz="6" w:space="0" w:color="D9E0E5"/>
+              <w:insideV w:val="single" w:sz="6" w:space="0" w:color="D9E0E5"/>
+            </w:tcBorders>
+            <w:tcMar>
+              <w:top w:w="110" w:type="dxa"/>
+              <w:start w:w="140" w:type="dxa"/>
+              <w:bottom w:w="110" w:type="dxa"/>
+              <w:end w:w="140" w:type="dxa"/>
+            </w:tcMar>
+            <w:vAlign w:val="center"/>
+          </w:tcPr>
+          <w:p>
+            <w:pPr>
+              <w:spacing w:after="0"/>
+            </w:pPr>
+            <w:r>
+              <w:rPr>
+                <w:rFonts w:ascii="Microsoft YaHei" w:hAnsi="Microsoft YaHei" w:eastAsia="Microsoft YaHei"/>
+                <w:color w:val="202A36"/>
+                <w:sz w:val="18"/>
+              </w:rPr>
+              <w:t>查看在线或离线节点、对端 IP 和状态；点击在线节点可切换当前目标。</w:t>
+            </w:r>
+          </w:p>
+        </w:tc>
+      </w:tr>
+      <w:tr>
+        <w:tc>
+          <w:tcPr>
+            <w:tcW w:type="dxa" w:w="2376"/>
             <w:shd w:fill="FFFFFF"/>
             <w:tcBorders>
               <w:top w:val="single" w:sz="6" w:space="0" w:color="D9E0E5"/>
@@ -642,7 +778,41 @@
                 <w:color w:val="202A36"/>
                 <w:sz w:val="18"/>
               </w:rPr>
-              <w:t>查看已发现设备，点击设备行可切换当前目标；下方可保存设备别名。</w:t>
+              <w:t>LIVE MONITOR</w:t>
+            </w:r>
+          </w:p>
+        </w:tc>
+        <w:tc>
+          <w:tcPr>
+            <w:tcW w:type="dxa" w:w="7200"/>
+            <w:shd w:fill="FFFFFF"/>
+            <w:tcBorders>
+              <w:top w:val="single" w:sz="6" w:space="0" w:color="D9E0E5"/>
+              <w:left w:val="single" w:sz="6" w:space="0" w:color="D9E0E5"/>
+              <w:bottom w:val="single" w:sz="6" w:space="0" w:color="D9E0E5"/>
+              <w:right w:val="single" w:sz="6" w:space="0" w:color="D9E0E5"/>
+              <w:insideH w:val="single" w:sz="6" w:space="0" w:color="D9E0E5"/>
+              <w:insideV w:val="single" w:sz="6" w:space="0" w:color="D9E0E5"/>
+            </w:tcBorders>
+            <w:tcMar>
+              <w:top w:w="110" w:type="dxa"/>
+              <w:start w:w="140" w:type="dxa"/>
+              <w:bottom w:w="110" w:type="dxa"/>
+              <w:end w:w="140" w:type="dxa"/>
+            </w:tcMar>
+            <w:vAlign w:val="center"/>
+          </w:tcPr>
+          <w:p>
+            <w:pPr>
+              <w:spacing w:after="0"/>
+            </w:pPr>
+            <w:r>
+              <w:rPr>
+                <w:rFonts w:ascii="Microsoft YaHei" w:hAnsi="Microsoft YaHei" w:eastAsia="Microsoft YaHei"/>
+                <w:color w:val="202A36"/>
+                <w:sz w:val="18"/>
+              </w:rPr>
+              <w:t>查看 IIS3DWB 三轴振动曲线、JY61PL 姿态和 Stream Health。</w:t>
             </w:r>
           </w:p>
         </w:tc>
@@ -678,7 +848,7 @@
                 <w:color w:val="202A36"/>
                 <w:sz w:val="18"/>
               </w:rPr>
-              <w:t>LIVE MONITOR</w:t>
+              <w:t>DIAGNOSTICS</w:t>
             </w:r>
           </w:p>
         </w:tc>
@@ -712,7 +882,7 @@
                 <w:color w:val="202A36"/>
                 <w:sz w:val="18"/>
               </w:rPr>
-              <w:t>查看 IIS3DWB 三轴振动曲线、JY61PL 姿态和 Stream Health。</w:t>
+              <w:t>查看解析器、链路、固件和存储计数器。</w:t>
             </w:r>
           </w:p>
         </w:tc>
@@ -748,7 +918,7 @@
                 <w:color w:val="202A36"/>
                 <w:sz w:val="18"/>
               </w:rPr>
-              <w:t>DIAGNOSTICS</w:t>
+              <w:t>CONSOLE</w:t>
             </w:r>
           </w:p>
         </w:tc>
@@ -782,7 +952,7 @@
                 <w:color w:val="202A36"/>
                 <w:sz w:val="18"/>
               </w:rPr>
-              <w:t>查看解析器、链路、固件和存储计数器。</w:t>
+              <w:t>查看设备回复，必要时发送高级 AT 命令。</w:t>
             </w:r>
           </w:p>
         </w:tc>
@@ -818,7 +988,7 @@
                 <w:color w:val="202A36"/>
                 <w:sz w:val="18"/>
               </w:rPr>
-              <w:t>CONSOLE</w:t>
+              <w:t>SD ARCHIVE</w:t>
             </w:r>
           </w:p>
         </w:tc>
@@ -826,76 +996,6 @@
           <w:tcPr>
             <w:tcW w:type="dxa" w:w="7200"/>
             <w:shd w:fill="EAF3F8"/>
-            <w:tcBorders>
-              <w:top w:val="single" w:sz="6" w:space="0" w:color="D9E0E5"/>
-              <w:left w:val="single" w:sz="6" w:space="0" w:color="D9E0E5"/>
-              <w:bottom w:val="single" w:sz="6" w:space="0" w:color="D9E0E5"/>
-              <w:right w:val="single" w:sz="6" w:space="0" w:color="D9E0E5"/>
-              <w:insideH w:val="single" w:sz="6" w:space="0" w:color="D9E0E5"/>
-              <w:insideV w:val="single" w:sz="6" w:space="0" w:color="D9E0E5"/>
-            </w:tcBorders>
-            <w:tcMar>
-              <w:top w:w="110" w:type="dxa"/>
-              <w:start w:w="140" w:type="dxa"/>
-              <w:bottom w:w="110" w:type="dxa"/>
-              <w:end w:w="140" w:type="dxa"/>
-            </w:tcMar>
-            <w:vAlign w:val="center"/>
-          </w:tcPr>
-          <w:p>
-            <w:pPr>
-              <w:spacing w:after="0"/>
-            </w:pPr>
-            <w:r>
-              <w:rPr>
-                <w:rFonts w:ascii="Microsoft YaHei" w:hAnsi="Microsoft YaHei" w:eastAsia="Microsoft YaHei"/>
-                <w:color w:val="202A36"/>
-                <w:sz w:val="18"/>
-              </w:rPr>
-              <w:t>查看设备回复，必要时发送高级 AT 命令。</w:t>
-            </w:r>
-          </w:p>
-        </w:tc>
-      </w:tr>
-      <w:tr>
-        <w:tc>
-          <w:tcPr>
-            <w:tcW w:type="dxa" w:w="2376"/>
-            <w:shd w:fill="FFFFFF"/>
-            <w:tcBorders>
-              <w:top w:val="single" w:sz="6" w:space="0" w:color="D9E0E5"/>
-              <w:left w:val="single" w:sz="6" w:space="0" w:color="D9E0E5"/>
-              <w:bottom w:val="single" w:sz="6" w:space="0" w:color="D9E0E5"/>
-              <w:right w:val="single" w:sz="6" w:space="0" w:color="D9E0E5"/>
-              <w:insideH w:val="single" w:sz="6" w:space="0" w:color="D9E0E5"/>
-              <w:insideV w:val="single" w:sz="6" w:space="0" w:color="D9E0E5"/>
-            </w:tcBorders>
-            <w:tcMar>
-              <w:top w:w="110" w:type="dxa"/>
-              <w:start w:w="140" w:type="dxa"/>
-              <w:bottom w:w="110" w:type="dxa"/>
-              <w:end w:w="140" w:type="dxa"/>
-            </w:tcMar>
-            <w:vAlign w:val="center"/>
-          </w:tcPr>
-          <w:p>
-            <w:pPr>
-              <w:spacing w:after="0"/>
-            </w:pPr>
-            <w:r>
-              <w:rPr>
-                <w:rFonts w:ascii="Microsoft YaHei" w:hAnsi="Microsoft YaHei" w:eastAsia="Microsoft YaHei"/>
-                <w:color w:val="202A36"/>
-                <w:sz w:val="18"/>
-              </w:rPr>
-              <w:t>SD ARCHIVE</w:t>
-            </w:r>
-          </w:p>
-        </w:tc>
-        <w:tc>
-          <w:tcPr>
-            <w:tcW w:type="dxa" w:w="7200"/>
-            <w:shd w:fill="FFFFFF"/>
             <w:tcBorders>
               <w:top w:val="single" w:sz="6" w:space="0" w:color="D9E0E5"/>
               <w:left w:val="single" w:sz="6" w:space="0" w:color="D9E0E5"/>
@@ -934,13 +1034,9 @@
       </w:pPr>
     </w:p>
     <w:p>
-      <w:r>
-        <w:br w:type="page"/>
-      </w:r>
-    </w:p>
-    <w:p>
       <w:pPr>
         <w:pStyle w:val="Heading1"/>
+        <w:pageBreakBefore/>
       </w:pPr>
       <w:r>
         <w:rPr>
@@ -949,7 +1045,7 @@
           <w:color w:val="000000"/>
           <w:sz w:val="32"/>
         </w:rPr>
-        <w:t>2 连接设备</w:t>
+        <w:t>2 连接 Wi-Fi 设备</w:t>
       </w:r>
     </w:p>
     <w:p>
@@ -962,7 +1058,7 @@
           <w:color w:val="202A36"/>
           <w:sz w:val="21"/>
         </w:rPr>
-        <w:t>下面以 USB CDC 连接 STM32 为例。连接后还要显式选择 CDC 实时目标并启动采集。</w:t>
+        <w:t>Wi-Fi 模式下，上位机在电脑端监听 TCP，ESP 网关主动连接上位机。监听建立后，可在 DEVICES 中同时查看多个网关节点。</w:t>
       </w:r>
     </w:p>
     <w:p>
@@ -983,7 +1079,7 @@
               <a:graphicData uri="http://schemas.openxmlformats.org/drawingml/2006/picture">
                 <pic:pic>
                   <pic:nvPicPr>
-                    <pic:cNvPr id="0" name="native-cdc-live.png"/>
+                    <pic:cNvPr id="0" name="sensorhost_wifi_live.png"/>
                     <pic:cNvPicPr/>
                   </pic:nvPicPr>
                   <pic:blipFill>
@@ -1016,7 +1112,7 @@
           <w:color w:val="5B6672"/>
           <w:sz w:val="18"/>
         </w:rPr>
-        <w:t>图 2  CDC 连接成功并显示实时数据时的界面</w:t>
+        <w:t>图 2  Wi-Fi 监听已启动并显示在线节点</w:t>
       </w:r>
     </w:p>
     <w:p>
@@ -1040,7 +1136,7 @@
           <w:color w:val="000000"/>
           <w:sz w:val="21"/>
         </w:rPr>
-        <w:t>插入 USB。</w:t>
+        <w:t>准备同一网络。</w:t>
       </w:r>
       <w:r>
         <w:rPr>
@@ -1048,7 +1144,7 @@
           <w:color w:val="202A36"/>
           <w:sz w:val="21"/>
         </w:rPr>
-        <w:t>给采集板上电，并用 USB 数据线连接电脑。</w:t>
+        <w:t>电脑和每个 ESP 网关加入同一个手机热点；关闭热点的客户端隔离，并允许 Windows 防火墙接收上位机 TCP 入站连接。</w:t>
       </w:r>
     </w:p>
     <w:p>
@@ -1072,7 +1168,7 @@
           <w:color w:val="000000"/>
           <w:sz w:val="21"/>
         </w:rPr>
-        <w:t>选择 CDC。</w:t>
+        <w:t>选择 WI-FI。</w:t>
       </w:r>
       <w:r>
         <w:rPr>
@@ -1080,7 +1176,7 @@
           <w:color w:val="202A36"/>
           <w:sz w:val="21"/>
         </w:rPr>
-        <w:t>在顶部连接区把通路选择为 CDC。</w:t>
+        <w:t>在顶部通路下拉框选择 WI-FI，左侧显示 WI-FI FIELD MODE 配置区。</w:t>
       </w:r>
     </w:p>
     <w:p>
@@ -1104,7 +1200,7 @@
           <w:color w:val="000000"/>
           <w:sz w:val="21"/>
         </w:rPr>
-        <w:t>刷新端口。</w:t>
+        <w:t>选择热点网卡。</w:t>
       </w:r>
       <w:r>
         <w:rPr>
@@ -1112,7 +1208,7 @@
           <w:color w:val="202A36"/>
           <w:sz w:val="21"/>
         </w:rPr>
-        <w:t>点击 REFRESH，在设备下拉框中选择 STM32 对应的 USB 串行设备（COMx）。</w:t>
+        <w:t>在 PHONE HOTSPOT INTERFACE 中选择手机热点对应的 IPv4 网卡，例如 192.168.43.100/24。</w:t>
       </w:r>
     </w:p>
     <w:p>
@@ -1136,7 +1232,7 @@
           <w:color w:val="000000"/>
           <w:sz w:val="21"/>
         </w:rPr>
-        <w:t>建立连接。</w:t>
+        <w:t>核对 PC IPv4。</w:t>
       </w:r>
       <w:r>
         <w:rPr>
@@ -1144,7 +1240,7 @@
           <w:color w:val="202A36"/>
           <w:sz w:val="21"/>
         </w:rPr>
-        <w:t>点击 CONNECT。右侧状态显示 CONNECTED，左侧 DEVICES 列表出现设备。</w:t>
+        <w:t>PC IPv4 PRESET IN ESP FIRMWARE 必须填写与所选网卡相同的地址；这不是随意填写的设备 IP。</w:t>
       </w:r>
     </w:p>
     <w:p>
@@ -1168,7 +1264,7 @@
           <w:color w:val="000000"/>
           <w:sz w:val="21"/>
         </w:rPr>
-        <w:t>选择实时目标。</w:t>
+        <w:t>核对端口。</w:t>
       </w:r>
       <w:r>
         <w:rPr>
@@ -1176,7 +1272,7 @@
           <w:color w:val="202A36"/>
           <w:sz w:val="21"/>
         </w:rPr>
-        <w:t>确认 LIVE TARGET 为 CDC。设备如果原来正在 UART 采集，请先 STOP，等待 IDLE / OK，再切换为 CDC。</w:t>
+        <w:t>默认 TCP LISTEN PORT 为 54321、UDP WAKE PORT 为 12345；如 ESP 固件使用其他值，按固件配置填写。</w:t>
       </w:r>
     </w:p>
     <w:p>
@@ -1200,7 +1296,7 @@
           <w:color w:val="000000"/>
           <w:sz w:val="21"/>
         </w:rPr>
-        <w:t>开始采集。</w:t>
+        <w:t>启动监听。</w:t>
       </w:r>
       <w:r>
         <w:rPr>
@@ -1208,21 +1304,31 @@
           <w:color w:val="202A36"/>
           <w:sz w:val="21"/>
         </w:rPr>
-        <w:t>点击 START，等待 CONSOLE 返回 OK；随后 LIVE MONITOR 开始刷新。</w:t>
+        <w:t>点击 CONNECT，右上角显示 LISTENING &lt;PC IPv4&gt;:&lt;TCP 端口&gt;。ESP 网关会主动连入；必要时可填写 OPTIONAL ESP IPv4 TARGETS 发送定向唤醒。</w:t>
       </w:r>
     </w:p>
     <w:p>
       <w:pPr>
-        <w:spacing w:before="60" w:after="120"/>
+        <w:spacing w:after="80"/>
+        <w:ind w:left="142" w:hanging="142"/>
       </w:pPr>
       <w:r>
         <w:rPr>
           <w:rFonts w:ascii="Microsoft YaHei" w:hAnsi="Microsoft YaHei" w:eastAsia="Microsoft YaHei"/>
           <w:b/>
-          <w:color w:val="B43E3E"/>
+          <w:color w:val="1DBFB4"/>
           <w:sz w:val="21"/>
         </w:rPr>
-        <w:t>注意：</w:t>
+        <w:t xml:space="preserve">7. </w:t>
+      </w:r>
+      <w:r>
+        <w:rPr>
+          <w:rFonts w:ascii="Microsoft YaHei" w:hAnsi="Microsoft YaHei" w:eastAsia="Microsoft YaHei"/>
+          <w:b/>
+          <w:color w:val="000000"/>
+          <w:sz w:val="21"/>
+        </w:rPr>
+        <w:t>选择节点并采集。</w:t>
       </w:r>
       <w:r>
         <w:rPr>
@@ -1230,17 +1336,13 @@
           <w:color w:val="202A36"/>
           <w:sz w:val="21"/>
         </w:rPr>
-        <w:t>如果找不到 COM 口，先点击 REFRESH，并在设备管理器确认实际 COM 号；不要固定假定一定是 COM6。</w:t>
-      </w:r>
-    </w:p>
-    <w:p>
-      <w:r>
-        <w:br w:type="page"/>
+        <w:t>等待 DEVICES 出现在线节点，点击目标行；将 LIVE TARGET 设为 UART，点击 START，等待 CONSOLE 返回 OK。</w:t>
       </w:r>
     </w:p>
     <w:p>
       <w:pPr>
         <w:pStyle w:val="Heading1"/>
+        <w:pageBreakBefore/>
       </w:pPr>
       <w:r>
         <w:rPr>
@@ -1262,12 +1364,13 @@
           <w:color w:val="202A36"/>
           <w:sz w:val="21"/>
         </w:rPr>
-        <w:t>采集开始后，LIVE MONITOR 是最常用页面。中间的大图是 IIS3DWB 三轴振动，右侧是 JY61PL 姿态和加速度。</w:t>
+        <w:t>采集开始后，LIVE MONITOR 是最常用页面。Wi-Fi 数据经过 ESP 网关转发到电脑；中间的大图是 IIS3DWB 三轴振动，右侧是 JY61PL 姿态和加速度。</w:t>
       </w:r>
     </w:p>
     <w:p>
       <w:pPr>
         <w:pStyle w:val="Heading2"/>
+        <w:pageBreakBefore w:val="0"/>
       </w:pPr>
       <w:r>
         <w:rPr>
@@ -1342,6 +1445,7 @@
     <w:p>
       <w:pPr>
         <w:pStyle w:val="Heading2"/>
+        <w:pageBreakBefore w:val="0"/>
       </w:pPr>
       <w:r>
         <w:rPr>
@@ -1380,7 +1484,7 @@
           <w:color w:val="202A36"/>
           <w:sz w:val="21"/>
         </w:rPr>
-        <w:t>CRC ERR 为 0，SEQ GAP、LINK ERR 在稳定链路下不持续增加。</w:t>
+        <w:t>CRC ERR 为 0，SEQ GAP、TRANSPORT DROP、LINK ERR 在稳定链路下不持续增加。</w:t>
       </w:r>
     </w:p>
     <w:p>
@@ -1401,6 +1505,7 @@
     <w:p>
       <w:pPr>
         <w:pStyle w:val="Heading2"/>
+        <w:pageBreakBefore w:val="0"/>
       </w:pPr>
       <w:r>
         <w:rPr>
@@ -1472,7 +1577,7 @@
                     <a:graphicData uri="http://schemas.openxmlformats.org/drawingml/2006/picture">
                       <pic:pic>
                         <pic:nvPicPr>
-                          <pic:cNvPr id="0" name="native-cdc-diagnostics.png"/>
+                          <pic:cNvPr id="0" name="sensorhost_wifi_diagnostics.png"/>
                           <pic:cNvPicPr/>
                         </pic:nvPicPr>
                         <pic:blipFill>
@@ -1545,7 +1650,7 @@
                     <a:graphicData uri="http://schemas.openxmlformats.org/drawingml/2006/picture">
                       <pic:pic>
                         <pic:nvPicPr>
-                          <pic:cNvPr id="0" name="native-cdc-console.png"/>
+                          <pic:cNvPr id="0" name="sensorhost_wifi_console.png"/>
                           <pic:cNvPicPr/>
                         </pic:nvPicPr>
                         <pic:blipFill>
@@ -1586,13 +1691,9 @@
       </w:tr>
     </w:tbl>
     <w:p>
-      <w:r>
-        <w:br w:type="page"/>
-      </w:r>
-    </w:p>
-    <w:p>
       <w:pPr>
         <w:pStyle w:val="Heading1"/>
+        <w:pageBreakBefore/>
       </w:pPr>
       <w:r>
         <w:rPr>
@@ -1614,7 +1715,7 @@
           <w:color w:val="202A36"/>
           <w:sz w:val="21"/>
         </w:rPr>
-        <w:t>RECORD 保存的是上位机连接后收到的实时 SDF1 数据，和 SD 卡中的历史存档是两条不同的数据路径。</w:t>
+        <w:t>RECORD 保存的是上位机通过 Wi-Fi 收到的实时 SDF1 数据，和设备 SD 卡中的历史存档是两条不同的数据路径。</w:t>
       </w:r>
     </w:p>
     <w:p>
@@ -1729,6 +1830,7 @@
     <w:p>
       <w:pPr>
         <w:pStyle w:val="Heading1"/>
+        <w:pageBreakBefore w:val="0"/>
       </w:pPr>
       <w:r>
         <w:rPr>
@@ -1750,7 +1852,7 @@
           <w:color w:val="202A36"/>
           <w:sz w:val="21"/>
         </w:rPr>
-        <w:t>SD ARCHIVE 用于把设备 SD 卡中的历史数据导出到电脑。导出前必须先让设备处于 IDLE。</w:t>
+        <w:t>SD ARCHIVE 用于把当前 Wi-Fi 节点设备 SD 卡中的历史数据导出到电脑。导出前必须先让设备处于 IDLE。</w:t>
       </w:r>
     </w:p>
     <w:p>
@@ -1992,6 +2094,7 @@
     <w:p>
       <w:pPr>
         <w:pStyle w:val="Heading1"/>
+        <w:pageBreakBefore w:val="0"/>
       </w:pPr>
       <w:r>
         <w:rPr>
@@ -2082,7 +2185,7 @@
           <w:color w:val="202A36"/>
           <w:sz w:val="21"/>
         </w:rPr>
-        <w:t>EXPORT PROGRESS：查看接收字节、SD 分配空间、速度和耗时。</w:t>
+        <w:t>EXPORT PROGRESS：查看接收字节、SD 分配空间、速度和耗时；Wi-Fi 导出时数据由当前节点经网关传回电脑。</w:t>
       </w:r>
     </w:p>
     <w:p>
@@ -2118,6 +2221,7 @@
     <w:p>
       <w:pPr>
         <w:pStyle w:val="Heading1"/>
+        <w:pageBreakBefore w:val="0"/>
       </w:pPr>
       <w:r>
         <w:rPr>
@@ -2379,13 +2483,9 @@
       </w:r>
     </w:p>
     <w:p>
-      <w:r>
-        <w:br w:type="page"/>
-      </w:r>
-    </w:p>
-    <w:p>
       <w:pPr>
         <w:pStyle w:val="Heading1"/>
+        <w:pageBreakBefore/>
       </w:pPr>
       <w:r>
         <w:rPr>
@@ -2531,6 +2631,7 @@
     <w:p>
       <w:pPr>
         <w:pStyle w:val="Heading1"/>
+        <w:pageBreakBefore w:val="0"/>
       </w:pPr>
       <w:r>
         <w:rPr>
@@ -2539,7 +2640,7 @@
           <w:color w:val="000000"/>
           <w:sz w:val="32"/>
         </w:rPr>
-        <w:t>9 两个常见提示</w:t>
+        <w:t>9 常见提示</w:t>
       </w:r>
     </w:p>
     <w:p>
@@ -2554,7 +2655,7 @@
           <w:color w:val="202A36"/>
           <w:sz w:val="21"/>
         </w:rPr>
-        <w:t>已 CONNECTED 但无曲线：确认左侧选中了在线设备，LIVE TARGET=CDC，且已点击 START；再看 DIAGNOSTICS 的帧数是否增加。</w:t>
+        <w:t>监听已启动但没有节点：确认电脑和 ESP 在同一热点、PC IPv4 与 ESP 固件预设值一致、热点未启用客户端隔离，并允许 TCP 入站；必要时在 OPTIONAL ESP IPv4 TARGETS 填写地址后重试。</w:t>
       </w:r>
     </w:p>
     <w:p>
@@ -2569,7 +2670,22 @@
           <w:color w:val="202A36"/>
           <w:sz w:val="21"/>
         </w:rPr>
-        <w:t>选择 CDC 出现 ERROR:STATE：设备仍在采集或实时目标不是 CDC。按 STOP → 等待 IDLE / OK → 选择 CDC → START 的顺序重试。</w:t>
+        <w:t>节点已在线但无曲线：确认选中了在线节点，LIVE TARGET=UART，且已点击 START；再看 DIAGNOSTICS 的帧数、UART ERR 和 TRANSPORT DROP 是否增加。</w:t>
+      </w:r>
+    </w:p>
+    <w:p>
+      <w:pPr>
+        <w:pStyle w:val="ListBullet"/>
+        <w:spacing w:after="60"/>
+        <w:ind w:left="283"/>
+      </w:pPr>
+      <w:r>
+        <w:rPr>
+          <w:rFonts w:ascii="Microsoft YaHei" w:hAnsi="Microsoft YaHei" w:eastAsia="Microsoft YaHei"/>
+          <w:color w:val="202A36"/>
+          <w:sz w:val="21"/>
+        </w:rPr>
+        <w:t>CDC 调试出现 ERROR:STATE：仅在 USB 调试时按 STOP → 等待 IDLE / OK → 选择 CDC → START 的顺序重试。</w:t>
       </w:r>
     </w:p>
     <w:p>

</xml_diff>

<commit_message>
docs: anonymize hardware identifiers in guide
</commit_message>
<xml_diff>
--- a/docs/SensorHost上位机操作指南.docx
+++ b/docs/SensorHost上位机操作指南.docx
@@ -87,7 +87,7 @@
           <w:color w:val="202A36"/>
           <w:sz w:val="21"/>
         </w:rPr>
-        <w:t>让电脑和每个 ESP 网关加入同一个手机热点，确认热点允许设备之间通信。</w:t>
+        <w:t>让电脑和每个设备网关加入同一个手机热点，确认热点允许设备之间通信。</w:t>
       </w:r>
     </w:p>
     <w:p>
@@ -245,7 +245,7 @@
           <w:color w:val="202A36"/>
           <w:sz w:val="21"/>
         </w:rPr>
-        <w:t>电脑已连接手机热点或现场 Wi-Fi；每个 ESP 网关也加入同一个网络。</w:t>
+        <w:t>电脑已连接手机热点或现场 Wi-Fi；每个设备网关也加入同一个网络。</w:t>
       </w:r>
     </w:p>
     <w:p>
@@ -260,7 +260,7 @@
           <w:color w:val="202A36"/>
           <w:sz w:val="21"/>
         </w:rPr>
-        <w:t>已知 ESP 固件中预设的 PC IPv4；上位机选择的热点网卡 IPv4 必须与它一致。</w:t>
+        <w:t>已知设备端配置中预设的 PC IPv4；上位机选择的热点网卡 IPv4 必须与它一致。</w:t>
       </w:r>
     </w:p>
     <w:p>
@@ -602,7 +602,7 @@
                 <w:color w:val="202A36"/>
                 <w:sz w:val="18"/>
               </w:rPr>
-              <w:t>选择手机热点网卡，填写 PC IPv4、TCP/UDP 端口和可选 ESP IPv4 目标。</w:t>
+              <w:t>选择手机热点网卡，填写 PC IPv4、TCP/UDP 端口和可选设备 IPv4 目标。</w:t>
             </w:r>
           </w:p>
         </w:tc>
@@ -812,7 +812,7 @@
                 <w:color w:val="202A36"/>
                 <w:sz w:val="18"/>
               </w:rPr>
-              <w:t>查看 IIS3DWB 三轴振动曲线、JY61PL 姿态和 Stream Health。</w:t>
+              <w:t>查看三轴振动曲线、姿态和 Stream Health。</w:t>
             </w:r>
           </w:p>
         </w:tc>
@@ -1058,7 +1058,7 @@
           <w:color w:val="202A36"/>
           <w:sz w:val="21"/>
         </w:rPr>
-        <w:t>Wi-Fi 模式下，上位机在电脑端监听 TCP，ESP 网关主动连接上位机。监听建立后，可在 DEVICES 中同时查看多个网关节点。</w:t>
+        <w:t>Wi-Fi 模式下，上位机在电脑端监听 TCP，设备网关主动连接上位机。监听建立后，可在 DEVICES 中同时查看多个网关节点。</w:t>
       </w:r>
     </w:p>
     <w:p>
@@ -1144,7 +1144,7 @@
           <w:color w:val="202A36"/>
           <w:sz w:val="21"/>
         </w:rPr>
-        <w:t>电脑和每个 ESP 网关加入同一个手机热点；关闭热点的客户端隔离，并允许 Windows 防火墙接收上位机 TCP 入站连接。</w:t>
+        <w:t>电脑和每个设备网关加入同一个手机热点；关闭热点的客户端隔离，并允许 Windows 防火墙接收上位机 TCP 入站连接。</w:t>
       </w:r>
     </w:p>
     <w:p>
@@ -1240,7 +1240,7 @@
           <w:color w:val="202A36"/>
           <w:sz w:val="21"/>
         </w:rPr>
-        <w:t>PC IPv4 PRESET IN ESP FIRMWARE 必须填写与所选网卡相同的地址；这不是随意填写的设备 IP。</w:t>
+        <w:t>PC IPv4 PRESET IN DEVICE CONFIG 必须填写与所选网卡相同的地址；这不是随意填写的设备 IP。</w:t>
       </w:r>
     </w:p>
     <w:p>
@@ -1272,7 +1272,7 @@
           <w:color w:val="202A36"/>
           <w:sz w:val="21"/>
         </w:rPr>
-        <w:t>默认 TCP LISTEN PORT 为 54321、UDP WAKE PORT 为 12345；如 ESP 固件使用其他值，按固件配置填写。</w:t>
+        <w:t>默认 TCP LISTEN PORT 为 54321、UDP WAKE PORT 为 12345；如设备端配置使用其他值，按设备端配置填写。</w:t>
       </w:r>
     </w:p>
     <w:p>
@@ -1304,7 +1304,7 @@
           <w:color w:val="202A36"/>
           <w:sz w:val="21"/>
         </w:rPr>
-        <w:t>点击 CONNECT，右上角显示 LISTENING &lt;PC IPv4&gt;:&lt;TCP 端口&gt;。ESP 网关会主动连入；必要时可填写 OPTIONAL ESP IPv4 TARGETS 发送定向唤醒。</w:t>
+        <w:t>点击 CONNECT，右上角显示 LISTENING &lt;PC IPv4&gt;:&lt;TCP 端口&gt;。设备网关会主动连入；必要时可填写 OPTIONAL DEVICE IPv4 TARGETS 发送定向唤醒。</w:t>
       </w:r>
     </w:p>
     <w:p>
@@ -1364,7 +1364,7 @@
           <w:color w:val="202A36"/>
           <w:sz w:val="21"/>
         </w:rPr>
-        <w:t>采集开始后，LIVE MONITOR 是最常用页面。Wi-Fi 数据经过 ESP 网关转发到电脑；中间的大图是 IIS3DWB 三轴振动，右侧是 JY61PL 姿态和加速度。</w:t>
+        <w:t>采集开始后，LIVE MONITOR 是最常用页面。Wi-Fi 数据经过设备网关转发到电脑；中间的大图是三轴振动，右侧是姿态和加速度。</w:t>
       </w:r>
     </w:p>
     <w:p>
@@ -2655,7 +2655,7 @@
           <w:color w:val="202A36"/>
           <w:sz w:val="21"/>
         </w:rPr>
-        <w:t>监听已启动但没有节点：确认电脑和 ESP 在同一热点、PC IPv4 与 ESP 固件预设值一致、热点未启用客户端隔离，并允许 TCP 入站；必要时在 OPTIONAL ESP IPv4 TARGETS 填写地址后重试。</w:t>
+        <w:t>监听已启动但没有节点：确认电脑和设备网关在同一热点、PC IPv4 与设备端配置预设值一致、热点未启用客户端隔离，并允许 TCP 入站；必要时在 OPTIONAL DEVICE IPv4 TARGETS 填写地址后重试。</w:t>
       </w:r>
     </w:p>
     <w:p>

</xml_diff>

<commit_message>
docs: add computer hotspot network setup
</commit_message>
<xml_diff>
--- a/docs/SensorHost上位机操作指南.docx
+++ b/docs/SensorHost上位机操作指南.docx
@@ -87,7 +87,7 @@
           <w:color w:val="202A36"/>
           <w:sz w:val="21"/>
         </w:rPr>
-        <w:t>让电脑和每个设备网关加入同一个手机热点，确认热点允许设备之间通信。</w:t>
+        <w:t>让电脑连接可用 Wi-Fi 并开启移动热点，设备网关加入该热点，确认热点允许设备之间通信。</w:t>
       </w:r>
     </w:p>
     <w:p>
@@ -245,7 +245,7 @@
           <w:color w:val="202A36"/>
           <w:sz w:val="21"/>
         </w:rPr>
-        <w:t>电脑已连接手机热点或现场 Wi-Fi；每个设备网关也加入同一个网络。</w:t>
+        <w:t>电脑先连接可用 Wi-Fi，再开启移动热点；每个设备网关加入电脑热点。</w:t>
       </w:r>
     </w:p>
     <w:p>
@@ -260,7 +260,7 @@
           <w:color w:val="202A36"/>
           <w:sz w:val="21"/>
         </w:rPr>
-        <w:t>已知设备端配置中预设的 PC IPv4；上位机选择的热点网卡 IPv4 必须与它一致。</w:t>
+        <w:t>热点对应 WLAN 网卡的 IPv4 固定为 192.168.137.201；设备端目标地址也使用这个 IP。</w:t>
       </w:r>
     </w:p>
     <w:p>
@@ -312,6 +312,302 @@
           <w:color w:val="000000"/>
           <w:sz w:val="32"/>
         </w:rPr>
+        <w:t>电脑热点与固定 IP 配置</w:t>
+      </w:r>
+    </w:p>
+    <w:p>
+      <w:pPr>
+        <w:spacing w:after="100"/>
+      </w:pPr>
+      <w:r>
+        <w:rPr>
+          <w:rFonts w:ascii="Microsoft YaHei" w:hAnsi="Microsoft YaHei" w:eastAsia="Microsoft YaHei"/>
+          <w:color w:val="202A36"/>
+          <w:sz w:val="21"/>
+        </w:rPr>
+        <w:t>本指南采用“电脑连接 Wi-Fi、电脑开启热点、设备主动连接电脑”的网络方式。电脑热点对应网卡需要使用固定地址 192.168.137.201，设备端把这个地址作为数据接收目标。</w:t>
+      </w:r>
+    </w:p>
+    <w:p>
+      <w:pPr>
+        <w:spacing w:after="80"/>
+        <w:ind w:left="142" w:hanging="142"/>
+      </w:pPr>
+      <w:r>
+        <w:rPr>
+          <w:rFonts w:ascii="Microsoft YaHei" w:hAnsi="Microsoft YaHei" w:eastAsia="Microsoft YaHei"/>
+          <w:b/>
+          <w:color w:val="1DBFB4"/>
+          <w:sz w:val="21"/>
+        </w:rPr>
+        <w:t xml:space="preserve">1. </w:t>
+      </w:r>
+      <w:r>
+        <w:rPr>
+          <w:rFonts w:ascii="Microsoft YaHei" w:hAnsi="Microsoft YaHei" w:eastAsia="Microsoft YaHei"/>
+          <w:b/>
+          <w:color w:val="000000"/>
+          <w:sz w:val="21"/>
+        </w:rPr>
+        <w:t>连接外网 Wi-Fi。</w:t>
+      </w:r>
+      <w:r>
+        <w:rPr>
+          <w:rFonts w:ascii="Microsoft YaHei" w:hAnsi="Microsoft YaHei" w:eastAsia="Microsoft YaHei"/>
+          <w:color w:val="202A36"/>
+          <w:sz w:val="21"/>
+        </w:rPr>
+        <w:t>电脑先连接可用的 Wi-Fi 网络；如果现场不需要访问外网，也可以只保证无线网卡正常工作。</w:t>
+      </w:r>
+    </w:p>
+    <w:p>
+      <w:pPr>
+        <w:spacing w:after="80"/>
+        <w:ind w:left="142" w:hanging="142"/>
+      </w:pPr>
+      <w:r>
+        <w:rPr>
+          <w:rFonts w:ascii="Microsoft YaHei" w:hAnsi="Microsoft YaHei" w:eastAsia="Microsoft YaHei"/>
+          <w:b/>
+          <w:color w:val="1DBFB4"/>
+          <w:sz w:val="21"/>
+        </w:rPr>
+        <w:t xml:space="preserve">2. </w:t>
+      </w:r>
+      <w:r>
+        <w:rPr>
+          <w:rFonts w:ascii="Microsoft YaHei" w:hAnsi="Microsoft YaHei" w:eastAsia="Microsoft YaHei"/>
+          <w:b/>
+          <w:color w:val="000000"/>
+          <w:sz w:val="21"/>
+        </w:rPr>
+        <w:t>开启移动热点。</w:t>
+      </w:r>
+      <w:r>
+        <w:rPr>
+          <w:rFonts w:ascii="Microsoft YaHei" w:hAnsi="Microsoft YaHei" w:eastAsia="Microsoft YaHei"/>
+          <w:color w:val="202A36"/>
+          <w:sz w:val="21"/>
+        </w:rPr>
+        <w:t>在 Windows 设置中开启移动热点，记下热点名称和密码，供设备加入。</w:t>
+      </w:r>
+    </w:p>
+    <w:p>
+      <w:pPr>
+        <w:spacing w:after="80"/>
+        <w:ind w:left="142" w:hanging="142"/>
+      </w:pPr>
+      <w:r>
+        <w:rPr>
+          <w:rFonts w:ascii="Microsoft YaHei" w:hAnsi="Microsoft YaHei" w:eastAsia="Microsoft YaHei"/>
+          <w:b/>
+          <w:color w:val="1DBFB4"/>
+          <w:sz w:val="21"/>
+        </w:rPr>
+        <w:t xml:space="preserve">3. </w:t>
+      </w:r>
+      <w:r>
+        <w:rPr>
+          <w:rFonts w:ascii="Microsoft YaHei" w:hAnsi="Microsoft YaHei" w:eastAsia="Microsoft YaHei"/>
+          <w:b/>
+          <w:color w:val="000000"/>
+          <w:sz w:val="21"/>
+        </w:rPr>
+        <w:t>打开网络连接。</w:t>
+      </w:r>
+      <w:r>
+        <w:rPr>
+          <w:rFonts w:ascii="Microsoft YaHei" w:hAnsi="Microsoft YaHei" w:eastAsia="Microsoft YaHei"/>
+          <w:color w:val="202A36"/>
+          <w:sz w:val="21"/>
+        </w:rPr>
+        <w:t>按 Win+R，输入 ncpa.cpl 并回车，直接打开网络连接窗口。</w:t>
+      </w:r>
+    </w:p>
+    <w:p>
+      <w:pPr>
+        <w:spacing w:after="80"/>
+        <w:ind w:left="142" w:hanging="142"/>
+      </w:pPr>
+      <w:r>
+        <w:rPr>
+          <w:rFonts w:ascii="Microsoft YaHei" w:hAnsi="Microsoft YaHei" w:eastAsia="Microsoft YaHei"/>
+          <w:b/>
+          <w:color w:val="1DBFB4"/>
+          <w:sz w:val="21"/>
+        </w:rPr>
+        <w:t xml:space="preserve">4. </w:t>
+      </w:r>
+      <w:r>
+        <w:rPr>
+          <w:rFonts w:ascii="Microsoft YaHei" w:hAnsi="Microsoft YaHei" w:eastAsia="Microsoft YaHei"/>
+          <w:b/>
+          <w:color w:val="000000"/>
+          <w:sz w:val="21"/>
+        </w:rPr>
+        <w:t>找到热点网卡。</w:t>
+      </w:r>
+      <w:r>
+        <w:rPr>
+          <w:rFonts w:ascii="Microsoft YaHei" w:hAnsi="Microsoft YaHei" w:eastAsia="Microsoft YaHei"/>
+          <w:color w:val="202A36"/>
+          <w:sz w:val="21"/>
+        </w:rPr>
+        <w:t>找到与电脑移动热点对应的 WLAN 网卡；不要把地址改到正在上网的其他网卡。</w:t>
+      </w:r>
+    </w:p>
+    <w:p>
+      <w:pPr>
+        <w:spacing w:after="80"/>
+        <w:ind w:left="142" w:hanging="142"/>
+      </w:pPr>
+      <w:r>
+        <w:rPr>
+          <w:rFonts w:ascii="Microsoft YaHei" w:hAnsi="Microsoft YaHei" w:eastAsia="Microsoft YaHei"/>
+          <w:b/>
+          <w:color w:val="1DBFB4"/>
+          <w:sz w:val="21"/>
+        </w:rPr>
+        <w:t xml:space="preserve">5. </w:t>
+      </w:r>
+      <w:r>
+        <w:rPr>
+          <w:rFonts w:ascii="Microsoft YaHei" w:hAnsi="Microsoft YaHei" w:eastAsia="Microsoft YaHei"/>
+          <w:b/>
+          <w:color w:val="000000"/>
+          <w:sz w:val="21"/>
+        </w:rPr>
+        <w:t>设置 IPv4。</w:t>
+      </w:r>
+      <w:r>
+        <w:rPr>
+          <w:rFonts w:ascii="Microsoft YaHei" w:hAnsi="Microsoft YaHei" w:eastAsia="Microsoft YaHei"/>
+          <w:color w:val="202A36"/>
+          <w:sz w:val="21"/>
+        </w:rPr>
+        <w:t>右键 WLAN 网卡，打开属性，双击 Internet 协议版本 4 (TCP/IPv4)，选择“使用下面的 IP 地址”。</w:t>
+      </w:r>
+    </w:p>
+    <w:p>
+      <w:pPr>
+        <w:spacing w:after="80"/>
+        <w:ind w:left="142" w:hanging="142"/>
+      </w:pPr>
+      <w:r>
+        <w:rPr>
+          <w:rFonts w:ascii="Microsoft YaHei" w:hAnsi="Microsoft YaHei" w:eastAsia="Microsoft YaHei"/>
+          <w:b/>
+          <w:color w:val="1DBFB4"/>
+          <w:sz w:val="21"/>
+        </w:rPr>
+        <w:t xml:space="preserve">6. </w:t>
+      </w:r>
+      <w:r>
+        <w:rPr>
+          <w:rFonts w:ascii="Microsoft YaHei" w:hAnsi="Microsoft YaHei" w:eastAsia="Microsoft YaHei"/>
+          <w:b/>
+          <w:color w:val="000000"/>
+          <w:sz w:val="21"/>
+        </w:rPr>
+        <w:t>填写固定地址。</w:t>
+      </w:r>
+      <w:r>
+        <w:rPr>
+          <w:rFonts w:ascii="Microsoft YaHei" w:hAnsi="Microsoft YaHei" w:eastAsia="Microsoft YaHei"/>
+          <w:color w:val="202A36"/>
+          <w:sz w:val="21"/>
+        </w:rPr>
+        <w:t>IP 地址填写 192.168.137.201，子网掩码填写 255.255.255.0。网关和 DNS 按现场网络需要填写；设备端目标地址必须与 IP 地址完全一致。</w:t>
+      </w:r>
+    </w:p>
+    <w:p>
+      <w:pPr>
+        <w:keepNext/>
+        <w:spacing w:before="40" w:after="40"/>
+        <w:jc w:val="center"/>
+      </w:pPr>
+      <w:r>
+        <w:drawing>
+          <wp:inline xmlns:a="http://schemas.openxmlformats.org/drawingml/2006/main" xmlns:pic="http://schemas.openxmlformats.org/drawingml/2006/picture">
+            <wp:extent cx="2331720" cy="3107746"/>
+            <wp:docPr id="1" name="Picture 1"/>
+            <wp:cNvGraphicFramePr>
+              <a:graphicFrameLocks noChangeAspect="1"/>
+            </wp:cNvGraphicFramePr>
+            <a:graphic>
+              <a:graphicData uri="http://schemas.openxmlformats.org/drawingml/2006/picture">
+                <pic:pic>
+                  <pic:nvPicPr>
+                    <pic:cNvPr id="0" name="pc_hotspot_ip_setup.jpg"/>
+                    <pic:cNvPicPr/>
+                  </pic:nvPicPr>
+                  <pic:blipFill>
+                    <a:blip r:embed="rId10"/>
+                    <a:stretch>
+                      <a:fillRect/>
+                    </a:stretch>
+                  </pic:blipFill>
+                  <pic:spPr>
+                    <a:xfrm>
+                      <a:off x="0" y="0"/>
+                      <a:ext cx="2331720" cy="3107746"/>
+                    </a:xfrm>
+                    <a:prstGeom prst="rect"/>
+                  </pic:spPr>
+                </pic:pic>
+              </a:graphicData>
+            </a:graphic>
+          </wp:inline>
+        </w:drawing>
+      </w:r>
+    </w:p>
+    <w:p>
+      <w:pPr>
+        <w:pStyle w:val="Caption"/>
+      </w:pPr>
+      <w:r>
+        <w:rPr>
+          <w:rFonts w:ascii="Microsoft YaHei" w:hAnsi="Microsoft YaHei" w:eastAsia="Microsoft YaHei"/>
+          <w:color w:val="5B6672"/>
+          <w:sz w:val="18"/>
+        </w:rPr>
+        <w:t>图 1  Windows 网卡 IPv4 设置入口示意</w:t>
+      </w:r>
+    </w:p>
+    <w:p>
+      <w:pPr>
+        <w:spacing w:before="60" w:after="120"/>
+      </w:pPr>
+      <w:r>
+        <w:rPr>
+          <w:rFonts w:ascii="Microsoft YaHei" w:hAnsi="Microsoft YaHei" w:eastAsia="Microsoft YaHei"/>
+          <w:b/>
+          <w:color w:val="B43E3E"/>
+          <w:sz w:val="21"/>
+        </w:rPr>
+        <w:t>注意：</w:t>
+      </w:r>
+      <w:r>
+        <w:rPr>
+          <w:rFonts w:ascii="Microsoft YaHei" w:hAnsi="Microsoft YaHei" w:eastAsia="Microsoft YaHei"/>
+          <w:color w:val="202A36"/>
+          <w:sz w:val="21"/>
+        </w:rPr>
+        <w:t>如果设备无法连接，优先检查：设备是否加入电脑热点、修改 IP 的是否为热点对应 WLAN 网卡、上位机监听 IP 是否为 192.168.137.201，以及 Windows 防火墙是否允许对应端口。</w:t>
+      </w:r>
+    </w:p>
+    <w:p>
+      <w:pPr>
+        <w:pStyle w:val="Heading1"/>
+        <w:pageBreakBefore/>
+      </w:pPr>
+      <w:r>
+        <w:rPr>
+          <w:rFonts w:ascii="Microsoft YaHei" w:hAnsi="Microsoft YaHei" w:eastAsia="Microsoft YaHei"/>
+          <w:b/>
+          <w:color w:val="000000"/>
+          <w:sz w:val="32"/>
+        </w:rPr>
         <w:t>1 界面总览</w:t>
       </w:r>
     </w:p>
@@ -338,7 +634,7 @@
         <w:drawing>
           <wp:inline xmlns:a="http://schemas.openxmlformats.org/drawingml/2006/main" xmlns:pic="http://schemas.openxmlformats.org/drawingml/2006/picture">
             <wp:extent cx="5486400" cy="3429000"/>
-            <wp:docPr id="1" name="Picture 1"/>
+            <wp:docPr id="2" name="Picture 2"/>
             <wp:cNvGraphicFramePr>
               <a:graphicFrameLocks noChangeAspect="1"/>
             </wp:cNvGraphicFramePr>
@@ -350,7 +646,7 @@
                     <pic:cNvPicPr/>
                   </pic:nvPicPr>
                   <pic:blipFill>
-                    <a:blip r:embed="rId10"/>
+                    <a:blip r:embed="rId11"/>
                     <a:stretch>
                       <a:fillRect/>
                     </a:stretch>
@@ -379,7 +675,7 @@
           <w:color w:val="5B6672"/>
           <w:sz w:val="18"/>
         </w:rPr>
-        <w:t>图 1  Wi-Fi 模式连接配置界面</w:t>
+        <w:t>图 2  Wi-Fi 模式连接配置界面</w:t>
       </w:r>
     </w:p>
     <w:tbl>
@@ -1071,7 +1367,7 @@
         <w:drawing>
           <wp:inline xmlns:a="http://schemas.openxmlformats.org/drawingml/2006/main" xmlns:pic="http://schemas.openxmlformats.org/drawingml/2006/picture">
             <wp:extent cx="6080760" cy="3800475"/>
-            <wp:docPr id="2" name="Picture 2"/>
+            <wp:docPr id="3" name="Picture 3"/>
             <wp:cNvGraphicFramePr>
               <a:graphicFrameLocks noChangeAspect="1"/>
             </wp:cNvGraphicFramePr>
@@ -1083,7 +1379,7 @@
                     <pic:cNvPicPr/>
                   </pic:nvPicPr>
                   <pic:blipFill>
-                    <a:blip r:embed="rId11"/>
+                    <a:blip r:embed="rId12"/>
                     <a:stretch>
                       <a:fillRect/>
                     </a:stretch>
@@ -1112,7 +1408,7 @@
           <w:color w:val="5B6672"/>
           <w:sz w:val="18"/>
         </w:rPr>
-        <w:t>图 2  Wi-Fi 监听已启动并显示在线节点</w:t>
+        <w:t>图 3  Wi-Fi 监听已启动并显示在线节点</w:t>
       </w:r>
     </w:p>
     <w:p>
@@ -1144,7 +1440,7 @@
           <w:color w:val="202A36"/>
           <w:sz w:val="21"/>
         </w:rPr>
-        <w:t>电脑和每个设备网关加入同一个手机热点；关闭热点的客户端隔离，并允许 Windows 防火墙接收上位机 TCP 入站连接。</w:t>
+        <w:t>电脑连接 Wi-Fi 并开启移动热点，设备网关加入电脑热点；关闭热点的客户端隔离，并允许 Windows 防火墙接收上位机 TCP 入站连接。</w:t>
       </w:r>
     </w:p>
     <w:p>
@@ -1208,7 +1504,7 @@
           <w:color w:val="202A36"/>
           <w:sz w:val="21"/>
         </w:rPr>
-        <w:t>在 PHONE HOTSPOT INTERFACE 中选择手机热点对应的 IPv4 网卡，例如 192.168.43.100/24。</w:t>
+        <w:t>在 PHONE HOTSPOT INTERFACE 中选择电脑移动热点对应的 WLAN 网卡，例如 192.168.137.201/24。</w:t>
       </w:r>
     </w:p>
     <w:p>
@@ -1240,7 +1536,7 @@
           <w:color w:val="202A36"/>
           <w:sz w:val="21"/>
         </w:rPr>
-        <w:t>PC IPv4 PRESET IN DEVICE CONFIG 必须填写与所选网卡相同的地址；这不是随意填写的设备 IP。</w:t>
+        <w:t>PC IPv4 PRESET IN DEVICE CONFIG 填写 192.168.137.201，并与热点网卡实际地址相同；这不是随意填写的设备 IP。</w:t>
       </w:r>
     </w:p>
     <w:p>
@@ -1569,7 +1865,7 @@
               <w:drawing>
                 <wp:inline xmlns:a="http://schemas.openxmlformats.org/drawingml/2006/main" xmlns:pic="http://schemas.openxmlformats.org/drawingml/2006/picture">
                   <wp:extent cx="2880360" cy="1800225"/>
-                  <wp:docPr id="3" name="Picture 3"/>
+                  <wp:docPr id="4" name="Picture 4"/>
                   <wp:cNvGraphicFramePr>
                     <a:graphicFrameLocks noChangeAspect="1"/>
                   </wp:cNvGraphicFramePr>
@@ -1578,79 +1874,6 @@
                       <pic:pic>
                         <pic:nvPicPr>
                           <pic:cNvPr id="0" name="sensorhost_wifi_diagnostics.png"/>
-                          <pic:cNvPicPr/>
-                        </pic:nvPicPr>
-                        <pic:blipFill>
-                          <a:blip r:embed="rId12"/>
-                          <a:stretch>
-                            <a:fillRect/>
-                          </a:stretch>
-                        </pic:blipFill>
-                        <pic:spPr>
-                          <a:xfrm>
-                            <a:off x="0" y="0"/>
-                            <a:ext cx="2880360" cy="1800225"/>
-                          </a:xfrm>
-                          <a:prstGeom prst="rect"/>
-                        </pic:spPr>
-                      </pic:pic>
-                    </a:graphicData>
-                  </a:graphic>
-                </wp:inline>
-              </w:drawing>
-            </w:r>
-          </w:p>
-          <w:p>
-            <w:pPr>
-              <w:pStyle w:val="Caption"/>
-              <w:jc w:val="center"/>
-            </w:pPr>
-            <w:r>
-              <w:rPr>
-                <w:rFonts w:ascii="Microsoft YaHei" w:hAnsi="Microsoft YaHei" w:eastAsia="Microsoft YaHei"/>
-                <w:color w:val="5B6672"/>
-                <w:sz w:val="16"/>
-              </w:rPr>
-              <w:t>图 3  DIAGNOSTICS：帧数、CRC 与设备状态</w:t>
-            </w:r>
-          </w:p>
-        </w:tc>
-        <w:tc>
-          <w:tcPr>
-            <w:tcW w:type="dxa" w:w="4680"/>
-            <w:tcBorders>
-              <w:top w:val="single" w:sz="0" w:space="0" w:color="FFFFFF"/>
-              <w:left w:val="single" w:sz="0" w:space="0" w:color="FFFFFF"/>
-              <w:bottom w:val="single" w:sz="0" w:space="0" w:color="FFFFFF"/>
-              <w:right w:val="single" w:sz="0" w:space="0" w:color="FFFFFF"/>
-              <w:insideH w:val="single" w:sz="0" w:space="0" w:color="FFFFFF"/>
-              <w:insideV w:val="single" w:sz="0" w:space="0" w:color="FFFFFF"/>
-            </w:tcBorders>
-            <w:tcMar>
-              <w:top w:w="0" w:type="dxa"/>
-              <w:start w:w="50" w:type="dxa"/>
-              <w:bottom w:w="0" w:type="dxa"/>
-              <w:end w:w="50" w:type="dxa"/>
-            </w:tcMar>
-          </w:tcPr>
-          <w:p>
-            <w:pPr>
-              <w:keepNext/>
-              <w:jc w:val="center"/>
-            </w:pPr>
-            <w:r>
-              <w:drawing>
-                <wp:inline xmlns:a="http://schemas.openxmlformats.org/drawingml/2006/main" xmlns:pic="http://schemas.openxmlformats.org/drawingml/2006/picture">
-                  <wp:extent cx="2880360" cy="1800225"/>
-                  <wp:docPr id="4" name="Picture 4"/>
-                  <wp:cNvGraphicFramePr>
-                    <a:graphicFrameLocks noChangeAspect="1"/>
-                  </wp:cNvGraphicFramePr>
-                  <a:graphic>
-                    <a:graphicData uri="http://schemas.openxmlformats.org/drawingml/2006/picture">
-                      <pic:pic>
-                        <pic:nvPicPr>
-                          <pic:cNvPr id="0" name="sensorhost_wifi_console.png"/>
                           <pic:cNvPicPr/>
                         </pic:nvPicPr>
                         <pic:blipFill>
@@ -1684,7 +1907,80 @@
                 <w:color w:val="5B6672"/>
                 <w:sz w:val="16"/>
               </w:rPr>
-              <w:t>图 4  CONSOLE：查看 OK、状态和导出回复</w:t>
+              <w:t>图 4  DIAGNOSTICS：帧数、CRC 与设备状态</w:t>
+            </w:r>
+          </w:p>
+        </w:tc>
+        <w:tc>
+          <w:tcPr>
+            <w:tcW w:type="dxa" w:w="4680"/>
+            <w:tcBorders>
+              <w:top w:val="single" w:sz="0" w:space="0" w:color="FFFFFF"/>
+              <w:left w:val="single" w:sz="0" w:space="0" w:color="FFFFFF"/>
+              <w:bottom w:val="single" w:sz="0" w:space="0" w:color="FFFFFF"/>
+              <w:right w:val="single" w:sz="0" w:space="0" w:color="FFFFFF"/>
+              <w:insideH w:val="single" w:sz="0" w:space="0" w:color="FFFFFF"/>
+              <w:insideV w:val="single" w:sz="0" w:space="0" w:color="FFFFFF"/>
+            </w:tcBorders>
+            <w:tcMar>
+              <w:top w:w="0" w:type="dxa"/>
+              <w:start w:w="50" w:type="dxa"/>
+              <w:bottom w:w="0" w:type="dxa"/>
+              <w:end w:w="50" w:type="dxa"/>
+            </w:tcMar>
+          </w:tcPr>
+          <w:p>
+            <w:pPr>
+              <w:keepNext/>
+              <w:jc w:val="center"/>
+            </w:pPr>
+            <w:r>
+              <w:drawing>
+                <wp:inline xmlns:a="http://schemas.openxmlformats.org/drawingml/2006/main" xmlns:pic="http://schemas.openxmlformats.org/drawingml/2006/picture">
+                  <wp:extent cx="2880360" cy="1800225"/>
+                  <wp:docPr id="5" name="Picture 5"/>
+                  <wp:cNvGraphicFramePr>
+                    <a:graphicFrameLocks noChangeAspect="1"/>
+                  </wp:cNvGraphicFramePr>
+                  <a:graphic>
+                    <a:graphicData uri="http://schemas.openxmlformats.org/drawingml/2006/picture">
+                      <pic:pic>
+                        <pic:nvPicPr>
+                          <pic:cNvPr id="0" name="sensorhost_wifi_console.png"/>
+                          <pic:cNvPicPr/>
+                        </pic:nvPicPr>
+                        <pic:blipFill>
+                          <a:blip r:embed="rId14"/>
+                          <a:stretch>
+                            <a:fillRect/>
+                          </a:stretch>
+                        </pic:blipFill>
+                        <pic:spPr>
+                          <a:xfrm>
+                            <a:off x="0" y="0"/>
+                            <a:ext cx="2880360" cy="1800225"/>
+                          </a:xfrm>
+                          <a:prstGeom prst="rect"/>
+                        </pic:spPr>
+                      </pic:pic>
+                    </a:graphicData>
+                  </a:graphic>
+                </wp:inline>
+              </w:drawing>
+            </w:r>
+          </w:p>
+          <w:p>
+            <w:pPr>
+              <w:pStyle w:val="Caption"/>
+              <w:jc w:val="center"/>
+            </w:pPr>
+            <w:r>
+              <w:rPr>
+                <w:rFonts w:ascii="Microsoft YaHei" w:hAnsi="Microsoft YaHei" w:eastAsia="Microsoft YaHei"/>
+                <w:color w:val="5B6672"/>
+                <w:sz w:val="16"/>
+              </w:rPr>
+              <w:t>图 5  CONSOLE：查看 OK、状态和导出回复</w:t>
             </w:r>
           </w:p>
         </w:tc>
@@ -1865,7 +2161,7 @@
         <w:drawing>
           <wp:inline xmlns:a="http://schemas.openxmlformats.org/drawingml/2006/main" xmlns:pic="http://schemas.openxmlformats.org/drawingml/2006/picture">
             <wp:extent cx="6080760" cy="3800475"/>
-            <wp:docPr id="5" name="Picture 5"/>
+            <wp:docPr id="6" name="Picture 6"/>
             <wp:cNvGraphicFramePr>
               <a:graphicFrameLocks noChangeAspect="1"/>
             </wp:cNvGraphicFramePr>
@@ -1877,7 +2173,7 @@
                     <pic:cNvPicPr/>
                   </pic:nvPicPr>
                   <pic:blipFill>
-                    <a:blip r:embed="rId14"/>
+                    <a:blip r:embed="rId15"/>
                     <a:stretch>
                       <a:fillRect/>
                     </a:stretch>
@@ -1906,7 +2202,7 @@
           <w:color w:val="5B6672"/>
           <w:sz w:val="18"/>
         </w:rPr>
-        <w:t>图 5  SD ARCHIVE 页面：设备存档、导出按钮和本地导出库</w:t>
+        <w:t>图 6  SD ARCHIVE 页面：设备存档、导出按钮和本地导出库</w:t>
       </w:r>
     </w:p>
     <w:p>
@@ -2129,7 +2425,7 @@
         <w:drawing>
           <wp:inline xmlns:a="http://schemas.openxmlformats.org/drawingml/2006/main" xmlns:pic="http://schemas.openxmlformats.org/drawingml/2006/picture">
             <wp:extent cx="6080760" cy="3800475"/>
-            <wp:docPr id="6" name="Picture 6"/>
+            <wp:docPr id="7" name="Picture 7"/>
             <wp:cNvGraphicFramePr>
               <a:graphicFrameLocks noChangeAspect="1"/>
             </wp:cNvGraphicFramePr>
@@ -2141,7 +2437,7 @@
                     <pic:cNvPicPr/>
                   </pic:nvPicPr>
                   <pic:blipFill>
-                    <a:blip r:embed="rId15"/>
+                    <a:blip r:embed="rId16"/>
                     <a:stretch>
                       <a:fillRect/>
                     </a:stretch>
@@ -2170,7 +2466,7 @@
           <w:color w:val="5B6672"/>
           <w:sz w:val="18"/>
         </w:rPr>
-        <w:t>图 6  导出进行中：查看进度并可取消本次导出</w:t>
+        <w:t>图 7  导出进行中：查看进度并可取消本次导出</w:t>
       </w:r>
     </w:p>
     <w:p>
@@ -2256,7 +2552,7 @@
         <w:drawing>
           <wp:inline xmlns:a="http://schemas.openxmlformats.org/drawingml/2006/main" xmlns:pic="http://schemas.openxmlformats.org/drawingml/2006/picture">
             <wp:extent cx="6080760" cy="1672209"/>
-            <wp:docPr id="7" name="Picture 7"/>
+            <wp:docPr id="8" name="Picture 8"/>
             <wp:cNvGraphicFramePr>
               <a:graphicFrameLocks noChangeAspect="1"/>
             </wp:cNvGraphicFramePr>
@@ -2268,7 +2564,7 @@
                     <pic:cNvPicPr/>
                   </pic:nvPicPr>
                   <pic:blipFill>
-                    <a:blip r:embed="rId16"/>
+                    <a:blip r:embed="rId17"/>
                     <a:stretch>
                       <a:fillRect/>
                     </a:stretch>
@@ -2297,7 +2593,7 @@
           <w:color w:val="5B6672"/>
           <w:sz w:val="18"/>
         </w:rPr>
-        <w:t>图 7  SD 历史数据导出、导入上位机与回放的数据方向</w:t>
+        <w:t>图 8  SD 历史数据导出、导入上位机与回放的数据方向</w:t>
       </w:r>
     </w:p>
     <w:p>
@@ -2310,7 +2606,7 @@
         <w:drawing>
           <wp:inline xmlns:a="http://schemas.openxmlformats.org/drawingml/2006/main" xmlns:pic="http://schemas.openxmlformats.org/drawingml/2006/picture">
             <wp:extent cx="6080760" cy="3800475"/>
-            <wp:docPr id="8" name="Picture 8"/>
+            <wp:docPr id="9" name="Picture 9"/>
             <wp:cNvGraphicFramePr>
               <a:graphicFrameLocks noChangeAspect="1"/>
             </wp:cNvGraphicFramePr>
@@ -2322,7 +2618,7 @@
                     <pic:cNvPicPr/>
                   </pic:nvPicPr>
                   <pic:blipFill>
-                    <a:blip r:embed="rId17"/>
+                    <a:blip r:embed="rId18"/>
                     <a:stretch>
                       <a:fillRect/>
                     </a:stretch>
@@ -2351,7 +2647,7 @@
           <w:color w:val="5B6672"/>
           <w:sz w:val="18"/>
         </w:rPr>
-        <w:t>图 8  回放状态：文件名、播放控制、进度和倍速</w:t>
+        <w:t>图 9  回放状态：文件名、播放控制、进度和倍速</w:t>
       </w:r>
     </w:p>
     <w:p>

</xml_diff>